<commit_message>
doc: guide book update
</commit_message>
<xml_diff>
--- a/EazyBuild Operation Guide.docx
+++ b/EazyBuild Operation Guide.docx
@@ -176,24 +176,7 @@
       </w:r>
       <w:proofErr w:type="gramEnd"/>
       <w:r>
-        <w:t>选后，编译产物会自动替换目标路径下的同名文件。</w:t>
-      </w:r>
-    </w:p>
-    <w:p>
-      <w:pPr>
-        <w:numPr>
-          <w:ilvl w:val="1"/>
-          <w:numId w:val="1"/>
-        </w:numPr>
-      </w:pPr>
-      <w:r>
-        <w:t>可点击「</w:t>
-      </w:r>
-      <w:r>
-        <w:t>Replace File</w:t>
-      </w:r>
-      <w:r>
-        <w:t>」手动触发替换。</w:t>
+        <w:t>选后，编译产物会自动替换目标路径下的同名文件</w:t>
       </w:r>
     </w:p>
     <w:p>
@@ -433,7 +416,6 @@
     </w:p>
     <w:p>
       <w:r>
-        <w:lastRenderedPageBreak/>
         <w:t>三、路径配置（</w:t>
       </w:r>
       <w:r>
@@ -452,6 +434,15 @@
       </w:pPr>
       <w:r>
         <w:rPr>
+          <w:rFonts w:hint="eastAsia"/>
+          <w:b/>
+          <w:bCs/>
+        </w:rPr>
+        <w:lastRenderedPageBreak/>
+        <w:t xml:space="preserve">Local </w:t>
+      </w:r>
+      <w:r>
+        <w:rPr>
           <w:b/>
           <w:bCs/>
         </w:rPr>
@@ -506,6 +497,14 @@
       </w:pPr>
       <w:r>
         <w:rPr>
+          <w:rFonts w:hint="eastAsia"/>
+          <w:b/>
+          <w:bCs/>
+        </w:rPr>
+        <w:t xml:space="preserve">Local </w:t>
+      </w:r>
+      <w:r>
+        <w:rPr>
           <w:b/>
           <w:bCs/>
         </w:rPr>
@@ -592,15 +591,291 @@
       </w:r>
     </w:p>
     <w:p>
-      <w:r>
-        <w:pict w14:anchorId="6ED4B38E">
-          <v:rect id="_x0000_i1027" style="width:0;height:1.5pt" o:hralign="center" o:hrstd="t" o:hrnoshade="t" o:hr="t" fillcolor="black" stroked="f"/>
+      <w:pPr>
+        <w:numPr>
+          <w:ilvl w:val="0"/>
+          <w:numId w:val="2"/>
+        </w:numPr>
+      </w:pPr>
+      <w:r>
+        <w:rPr>
+          <w:rFonts w:eastAsia="Times New Roman" w:cstheme="minorHAnsi"/>
+          <w:b/>
+          <w:bCs/>
+          <w:color w:val="000000"/>
+          <w:kern w:val="0"/>
+          <w14:ligatures w14:val="none"/>
+        </w:rPr>
+        <w:t>Enable Remote Deployment</w:t>
+      </w:r>
+    </w:p>
+    <w:p>
+      <w:pPr>
+        <w:numPr>
+          <w:ilvl w:val="1"/>
+          <w:numId w:val="2"/>
+        </w:numPr>
+        <w:rPr>
+          <w:rFonts w:asciiTheme="minorEastAsia" w:hAnsiTheme="minorEastAsia" w:cstheme="minorHAnsi"/>
+        </w:rPr>
+      </w:pPr>
+      <w:proofErr w:type="gramStart"/>
+      <w:r>
+        <w:rPr>
+          <w:rFonts w:asciiTheme="minorEastAsia" w:hAnsiTheme="minorEastAsia" w:cstheme="minorHAnsi"/>
+          <w:kern w:val="0"/>
+          <w14:ligatures w14:val="none"/>
+        </w:rPr>
+        <w:t>勾选此</w:t>
+      </w:r>
+      <w:proofErr w:type="gramEnd"/>
+      <w:r>
+        <w:rPr>
+          <w:rFonts w:asciiTheme="minorEastAsia" w:hAnsiTheme="minorEastAsia" w:cstheme="minorHAnsi"/>
+          <w:kern w:val="0"/>
+          <w14:ligatures w14:val="none"/>
+        </w:rPr>
+        <w:t>选项以启用远程部署功能</w:t>
+      </w:r>
+    </w:p>
+    <w:p>
+      <w:pPr>
+        <w:numPr>
+          <w:ilvl w:val="0"/>
+          <w:numId w:val="2"/>
+        </w:numPr>
+        <w:rPr>
+          <w:rFonts w:asciiTheme="minorEastAsia" w:hAnsiTheme="minorEastAsia" w:cstheme="minorHAnsi"/>
+        </w:rPr>
+      </w:pPr>
+      <w:r>
+        <w:rPr>
+          <w:rFonts w:eastAsia="Times New Roman" w:cstheme="minorHAnsi"/>
+          <w:b/>
+          <w:bCs/>
+          <w:color w:val="000000"/>
+          <w:kern w:val="0"/>
+          <w14:ligatures w14:val="none"/>
+        </w:rPr>
+        <w:t>Remote Config</w:t>
+      </w:r>
+    </w:p>
+    <w:p>
+      <w:pPr>
+        <w:numPr>
+          <w:ilvl w:val="1"/>
+          <w:numId w:val="2"/>
+        </w:numPr>
+        <w:rPr>
+          <w:rFonts w:asciiTheme="minorEastAsia" w:hAnsiTheme="minorEastAsia" w:cstheme="minorHAnsi"/>
+        </w:rPr>
+      </w:pPr>
+      <w:r>
+        <w:rPr>
+          <w:rFonts w:asciiTheme="minorEastAsia" w:hAnsiTheme="minorEastAsia" w:cstheme="minorHAnsi"/>
+          <w:kern w:val="0"/>
+          <w14:ligatures w14:val="none"/>
+        </w:rPr>
+        <w:t>点击此按钮打开远程部署配置窗口，配置远程主机信息</w:t>
+      </w:r>
+    </w:p>
+    <w:p>
+      <w:r>
+        <w:pict w14:anchorId="256AD633">
+          <v:rect id="_x0000_i1072" style="width:0;height:1.5pt" o:hralign="center" o:hrstd="t" o:hrnoshade="t" o:hr="t" fillcolor="black" stroked="f"/>
         </w:pict>
       </w:r>
     </w:p>
     <w:p>
       <w:r>
-        <w:t>四、快速编译（</w:t>
+        <w:rPr>
+          <w:rFonts w:hint="eastAsia"/>
+        </w:rPr>
+        <w:t>四</w:t>
+      </w:r>
+      <w:r>
+        <w:t>、</w:t>
+      </w:r>
+      <w:r>
+        <w:rPr>
+          <w:rFonts w:hint="eastAsia"/>
+        </w:rPr>
+        <w:t>远端设置</w:t>
+      </w:r>
+      <w:r>
+        <w:t>（</w:t>
+      </w:r>
+      <w:r>
+        <w:rPr>
+          <w:rFonts w:hint="eastAsia"/>
+        </w:rPr>
+        <w:t>Remote Config</w:t>
+      </w:r>
+      <w:r>
+        <w:rPr>
+          <w:rFonts w:hint="eastAsia"/>
+        </w:rPr>
+        <w:t>）</w:t>
+      </w:r>
+    </w:p>
+    <w:p>
+      <w:pPr>
+        <w:ind w:firstLine="360"/>
+      </w:pPr>
+      <w:r>
+        <w:t xml:space="preserve">1. </w:t>
+      </w:r>
+      <w:r>
+        <w:t>远程主机配置</w:t>
+      </w:r>
+    </w:p>
+    <w:p>
+      <w:pPr>
+        <w:numPr>
+          <w:ilvl w:val="0"/>
+          <w:numId w:val="17"/>
+        </w:numPr>
+      </w:pPr>
+      <w:r>
+        <w:rPr>
+          <w:b/>
+          <w:bCs/>
+        </w:rPr>
+        <w:t>Remote Host</w:t>
+      </w:r>
+      <w:r>
+        <w:t>：输入远程主机地址，格式为</w:t>
+      </w:r>
+      <w:r>
+        <w:t>\\IP</w:t>
+      </w:r>
+      <w:r>
+        <w:t>地址（示例：</w:t>
+      </w:r>
+      <w:r>
+        <w:t>\\10.40.63.121</w:t>
+      </w:r>
+      <w:r>
+        <w:t>）</w:t>
+      </w:r>
+    </w:p>
+    <w:p>
+      <w:pPr>
+        <w:ind w:left="360"/>
+      </w:pPr>
+      <w:r>
+        <w:t xml:space="preserve">2. </w:t>
+      </w:r>
+      <w:r>
+        <w:t>远程路径配置</w:t>
+      </w:r>
+    </w:p>
+    <w:p>
+      <w:pPr>
+        <w:pStyle w:val="ListParagraph"/>
+        <w:numPr>
+          <w:ilvl w:val="0"/>
+          <w:numId w:val="17"/>
+        </w:numPr>
+      </w:pPr>
+      <w:r>
+        <w:rPr>
+          <w:b/>
+          <w:bCs/>
+        </w:rPr>
+        <w:t>Remote Path</w:t>
+      </w:r>
+      <w:r>
+        <w:t>：输入远程目标路径，用于存放构建后的文件（示例：</w:t>
+      </w:r>
+      <w:r>
+        <w:t>C:\Users\innosilicon\Desktop\test</w:t>
+      </w:r>
+      <w:r>
+        <w:t>）</w:t>
+      </w:r>
+    </w:p>
+    <w:p>
+      <w:pPr>
+        <w:ind w:left="360"/>
+      </w:pPr>
+      <w:r>
+        <w:t xml:space="preserve">3. </w:t>
+      </w:r>
+      <w:r>
+        <w:t>测试连接与确认</w:t>
+      </w:r>
+    </w:p>
+    <w:p>
+      <w:pPr>
+        <w:numPr>
+          <w:ilvl w:val="0"/>
+          <w:numId w:val="17"/>
+        </w:numPr>
+      </w:pPr>
+      <w:r>
+        <w:rPr>
+          <w:b/>
+          <w:bCs/>
+        </w:rPr>
+        <w:t>Test Connection</w:t>
+      </w:r>
+      <w:r>
+        <w:t>：点击此按钮测试与远程主机的连接是否正常</w:t>
+      </w:r>
+    </w:p>
+    <w:p>
+      <w:pPr>
+        <w:numPr>
+          <w:ilvl w:val="0"/>
+          <w:numId w:val="17"/>
+        </w:numPr>
+      </w:pPr>
+      <w:r>
+        <w:rPr>
+          <w:b/>
+          <w:bCs/>
+        </w:rPr>
+        <w:t>OK</w:t>
+      </w:r>
+      <w:r>
+        <w:t>：确认配置并关闭窗口</w:t>
+      </w:r>
+    </w:p>
+    <w:p>
+      <w:pPr>
+        <w:numPr>
+          <w:ilvl w:val="0"/>
+          <w:numId w:val="17"/>
+        </w:numPr>
+      </w:pPr>
+      <w:r>
+        <w:rPr>
+          <w:b/>
+          <w:bCs/>
+        </w:rPr>
+        <w:t>Cancel</w:t>
+      </w:r>
+      <w:r>
+        <w:t>：取消配置并关闭窗口</w:t>
+      </w:r>
+    </w:p>
+    <w:p>
+      <w:r>
+        <w:pict w14:anchorId="557BF357">
+          <v:rect id="_x0000_i1074" style="width:0;height:1.5pt" o:hralign="center" o:hrstd="t" o:hrnoshade="t" o:hr="t" fillcolor="black" stroked="f"/>
+        </w:pict>
+      </w:r>
+    </w:p>
+    <w:p>
+      <w:r>
+        <w:rPr>
+          <w:rFonts w:hint="eastAsia"/>
+        </w:rPr>
+        <w:t>五</w:t>
+      </w:r>
+      <w:r>
+        <w:t>、快速编译（</w:t>
       </w:r>
       <w:r>
         <w:t>Quick Build</w:t>
@@ -632,6 +907,7 @@
           <w:b/>
           <w:bCs/>
         </w:rPr>
+        <w:lastRenderedPageBreak/>
         <w:t xml:space="preserve">G0M </w:t>
       </w:r>
       <w:r>
@@ -874,7 +1150,13 @@
     </w:p>
     <w:p>
       <w:r>
-        <w:t>五、自定义编译（</w:t>
+        <w:rPr>
+          <w:rFonts w:hint="eastAsia"/>
+        </w:rPr>
+        <w:t>六</w:t>
+      </w:r>
+      <w:r>
+        <w:t>、自定义编译（</w:t>
       </w:r>
       <w:r>
         <w:t>Custom Build</w:t>
@@ -885,7 +1167,6 @@
     </w:p>
     <w:p>
       <w:r>
-        <w:lastRenderedPageBreak/>
         <w:t>当需要更精细的编译控制时使用：</w:t>
       </w:r>
     </w:p>
@@ -1017,7 +1298,13 @@
     </w:p>
     <w:p>
       <w:r>
-        <w:t>六、日志（</w:t>
+        <w:rPr>
+          <w:rFonts w:hint="eastAsia"/>
+        </w:rPr>
+        <w:t>七</w:t>
+      </w:r>
+      <w:r>
+        <w:t>、日志（</w:t>
       </w:r>
       <w:r>
         <w:t>Log</w:t>
@@ -1071,7 +1358,13 @@
     </w:p>
     <w:p>
       <w:r>
-        <w:t>七、标准操作流程</w:t>
+        <w:rPr>
+          <w:rFonts w:hint="eastAsia"/>
+        </w:rPr>
+        <w:t>八</w:t>
+      </w:r>
+      <w:r>
+        <w:t>、标准操作流程</w:t>
       </w:r>
     </w:p>
     <w:p>
@@ -1082,6 +1375,7 @@
         </w:numPr>
       </w:pPr>
       <w:r>
+        <w:lastRenderedPageBreak/>
         <w:t>配置</w:t>
       </w:r>
       <w:r>
@@ -1258,10 +1552,10 @@
     <w:p/>
     <w:p/>
     <w:p/>
+    <w:p/>
     <w:p>
       <w:proofErr w:type="spellStart"/>
       <w:r>
-        <w:lastRenderedPageBreak/>
         <w:t>EazyBuild</w:t>
       </w:r>
       <w:proofErr w:type="spellEnd"/>
@@ -1375,12 +1669,27 @@
     <w:p>
       <w:pPr>
         <w:numPr>
+          <w:ilvl w:val="0"/>
+          <w:numId w:val="7"/>
+        </w:numPr>
+      </w:pPr>
+      <w:r>
+        <w:rPr>
+          <w:b/>
+          <w:bCs/>
+        </w:rPr>
+        <w:t>Force Delete KMD File Before Building</w:t>
+      </w:r>
+    </w:p>
+    <w:p>
+      <w:pPr>
+        <w:numPr>
           <w:ilvl w:val="1"/>
           <w:numId w:val="7"/>
         </w:numPr>
       </w:pPr>
       <w:r>
-        <w:t>Click "Replace File" to manually trigger the replacement.</w:t>
+        <w:t>When checked, KMD (Kernel Mode Driver) files in the target path will be force-deleted before compilation to avoid interference from old files.</w:t>
       </w:r>
     </w:p>
     <w:p>
@@ -1395,32 +1704,7 @@
           <w:b/>
           <w:bCs/>
         </w:rPr>
-        <w:t>Force Delete KMD File Before Building</w:t>
-      </w:r>
-    </w:p>
-    <w:p>
-      <w:pPr>
-        <w:numPr>
-          <w:ilvl w:val="1"/>
-          <w:numId w:val="7"/>
-        </w:numPr>
-      </w:pPr>
-      <w:r>
-        <w:t>When checked, KMD (Kernel Mode Driver) files in the target path will be force-deleted before compilation to avoid interference from old files.</w:t>
-      </w:r>
-    </w:p>
-    <w:p>
-      <w:pPr>
-        <w:numPr>
-          <w:ilvl w:val="0"/>
-          <w:numId w:val="7"/>
-        </w:numPr>
-      </w:pPr>
-      <w:r>
-        <w:rPr>
-          <w:b/>
-          <w:bCs/>
-        </w:rPr>
+        <w:lastRenderedPageBreak/>
         <w:t>Architecture</w:t>
       </w:r>
     </w:p>
@@ -1571,7 +1855,6 @@
     </w:p>
     <w:p>
       <w:r>
-        <w:lastRenderedPageBreak/>
         <w:t>3. Path Configuration</w:t>
       </w:r>
     </w:p>
@@ -1584,6 +1867,14 @@
       </w:pPr>
       <w:r>
         <w:rPr>
+          <w:rFonts w:hint="eastAsia"/>
+          <w:b/>
+          <w:bCs/>
+        </w:rPr>
+        <w:t xml:space="preserve">Local </w:t>
+      </w:r>
+      <w:r>
+        <w:rPr>
           <w:b/>
           <w:bCs/>
         </w:rPr>
@@ -1621,6 +1912,14 @@
       </w:pPr>
       <w:r>
         <w:rPr>
+          <w:rFonts w:hint="eastAsia"/>
+          <w:b/>
+          <w:bCs/>
+        </w:rPr>
+        <w:t xml:space="preserve">Local </w:t>
+      </w:r>
+      <w:r>
+        <w:rPr>
           <w:b/>
           <w:bCs/>
         </w:rPr>
@@ -1667,15 +1966,312 @@
       </w:r>
     </w:p>
     <w:p>
+      <w:pPr>
+        <w:numPr>
+          <w:ilvl w:val="0"/>
+          <w:numId w:val="8"/>
+        </w:numPr>
+        <w:rPr>
+          <w:rFonts w:eastAsia="Times New Roman" w:cstheme="minorHAnsi"/>
+          <w:kern w:val="0"/>
+          <w14:ligatures w14:val="none"/>
+        </w:rPr>
+      </w:pPr>
+      <w:r>
+        <w:rPr>
+          <w:rFonts w:eastAsia="Times New Roman" w:cstheme="minorHAnsi"/>
+          <w:b/>
+          <w:bCs/>
+          <w:color w:val="000000"/>
+          <w:kern w:val="0"/>
+          <w14:ligatures w14:val="none"/>
+        </w:rPr>
+        <w:t>Enable Remote Deployment</w:t>
+      </w:r>
+    </w:p>
+    <w:p>
+      <w:pPr>
+        <w:numPr>
+          <w:ilvl w:val="1"/>
+          <w:numId w:val="8"/>
+        </w:numPr>
+        <w:spacing w:after="0" w:line="240" w:lineRule="auto"/>
+        <w:rPr>
+          <w:rFonts w:eastAsia="Times New Roman" w:cstheme="minorHAnsi"/>
+          <w:kern w:val="0"/>
+          <w14:ligatures w14:val="none"/>
+        </w:rPr>
+      </w:pPr>
+      <w:r>
+        <w:rPr>
+          <w:rFonts w:eastAsia="Times New Roman" w:cstheme="minorHAnsi"/>
+          <w:color w:val="000000"/>
+          <w:kern w:val="0"/>
+          <w14:ligatures w14:val="none"/>
+        </w:rPr>
+        <w:t>Check this option to enable remote deployment functionality</w:t>
+      </w:r>
+      <w:r>
+        <w:rPr>
+          <w:rFonts w:eastAsia="Times New Roman" w:cstheme="minorHAnsi"/>
+          <w:kern w:val="0"/>
+          <w14:ligatures w14:val="none"/>
+        </w:rPr>
+        <w:t xml:space="preserve"> </w:t>
+      </w:r>
+    </w:p>
+    <w:p>
+      <w:pPr>
+        <w:spacing w:after="0" w:line="240" w:lineRule="auto"/>
+        <w:ind w:left="1440"/>
+        <w:rPr>
+          <w:rFonts w:eastAsia="Times New Roman" w:cstheme="minorHAnsi"/>
+          <w:kern w:val="0"/>
+          <w14:ligatures w14:val="none"/>
+        </w:rPr>
+      </w:pPr>
+    </w:p>
+    <w:p>
+      <w:pPr>
+        <w:numPr>
+          <w:ilvl w:val="0"/>
+          <w:numId w:val="8"/>
+        </w:numPr>
+        <w:rPr>
+          <w:rFonts w:cstheme="minorHAnsi"/>
+        </w:rPr>
+      </w:pPr>
+      <w:r>
+        <w:rPr>
+          <w:rFonts w:eastAsia="Times New Roman" w:cstheme="minorHAnsi"/>
+          <w:b/>
+          <w:bCs/>
+          <w:color w:val="000000"/>
+          <w:kern w:val="0"/>
+          <w14:ligatures w14:val="none"/>
+        </w:rPr>
+        <w:t>Remote Config</w:t>
+      </w:r>
+    </w:p>
+    <w:p>
+      <w:pPr>
+        <w:numPr>
+          <w:ilvl w:val="1"/>
+          <w:numId w:val="8"/>
+        </w:numPr>
+        <w:rPr>
+          <w:rFonts w:cstheme="minorHAnsi"/>
+        </w:rPr>
+      </w:pPr>
+      <w:r>
+        <w:rPr>
+          <w:rFonts w:eastAsia="Times New Roman" w:cstheme="minorHAnsi"/>
+          <w:color w:val="000000"/>
+          <w:kern w:val="0"/>
+          <w14:ligatures w14:val="none"/>
+        </w:rPr>
+        <w:lastRenderedPageBreak/>
+        <w:t>Click this button to open the remote deployment configuration window and configure remote host information</w:t>
+      </w:r>
+    </w:p>
+    <w:p>
+      <w:r>
+        <w:pict w14:anchorId="7E26EE70">
+          <v:rect id="_x0000_i1076" style="width:0;height:1.5pt" o:hralign="center" o:hrstd="t" o:hrnoshade="t" o:hr="t" fillcolor="black" stroked="f"/>
+        </w:pict>
+      </w:r>
+    </w:p>
+    <w:p>
+      <w:r>
+        <w:t xml:space="preserve">3. </w:t>
+      </w:r>
+      <w:r>
+        <w:t>Remote Config</w:t>
+      </w:r>
+    </w:p>
+    <w:p>
+      <w:pPr>
+        <w:numPr>
+          <w:ilvl w:val="0"/>
+          <w:numId w:val="18"/>
+        </w:numPr>
+      </w:pPr>
+      <w:r>
+        <w:rPr>
+          <w:b/>
+          <w:bCs/>
+        </w:rPr>
+        <w:t>Remote Host Configuration</w:t>
+      </w:r>
+    </w:p>
+    <w:p>
+      <w:pPr>
+        <w:numPr>
+          <w:ilvl w:val="1"/>
+          <w:numId w:val="18"/>
+        </w:numPr>
+      </w:pPr>
+      <w:r>
+        <w:t>Remote Host: Enter the remote host address in the format \IP address (example: \10.40.63.121)</w:t>
+      </w:r>
+    </w:p>
+    <w:p>
+      <w:pPr>
+        <w:numPr>
+          <w:ilvl w:val="0"/>
+          <w:numId w:val="18"/>
+        </w:numPr>
+      </w:pPr>
+      <w:r>
+        <w:rPr>
+          <w:b/>
+          <w:bCs/>
+        </w:rPr>
+        <w:t>Remote Path Configuration</w:t>
+      </w:r>
+    </w:p>
+    <w:p>
+      <w:pPr>
+        <w:numPr>
+          <w:ilvl w:val="1"/>
+          <w:numId w:val="18"/>
+        </w:numPr>
+        <w:rPr>
+          <w:rFonts w:eastAsia="Times New Roman" w:cstheme="minorHAnsi"/>
+          <w:kern w:val="0"/>
+          <w14:ligatures w14:val="none"/>
+        </w:rPr>
+      </w:pPr>
+      <w:r>
+        <w:rPr>
+          <w:b/>
+          <w:bCs/>
+        </w:rPr>
+        <w:t>Remote Path</w:t>
+      </w:r>
+      <w:r>
+        <w:t>: Enter the remote target path for storing built files (example: C:\Users\innosilicon\Desktop\test)</w:t>
+      </w:r>
+    </w:p>
+    <w:p>
+      <w:pPr>
+        <w:numPr>
+          <w:ilvl w:val="0"/>
+          <w:numId w:val="18"/>
+        </w:numPr>
+        <w:rPr>
+          <w:rFonts w:cstheme="minorHAnsi"/>
+        </w:rPr>
+      </w:pPr>
+      <w:r>
+        <w:rPr>
+          <w:rFonts w:eastAsia="Times New Roman" w:cstheme="minorHAnsi"/>
+          <w:b/>
+          <w:bCs/>
+          <w:color w:val="000000"/>
+          <w:kern w:val="0"/>
+          <w14:ligatures w14:val="none"/>
+        </w:rPr>
+        <w:t>Test Connection &amp; Confirmation</w:t>
+      </w:r>
+    </w:p>
+    <w:p>
+      <w:pPr>
+        <w:numPr>
+          <w:ilvl w:val="1"/>
+          <w:numId w:val="18"/>
+        </w:numPr>
+        <w:rPr>
+          <w:rFonts w:cstheme="minorHAnsi"/>
+        </w:rPr>
+      </w:pPr>
+      <w:r>
+        <w:rPr>
+          <w:rFonts w:eastAsia="Times New Roman" w:cstheme="minorHAnsi"/>
+          <w:b/>
+          <w:bCs/>
+          <w:color w:val="000000"/>
+          <w:kern w:val="0"/>
+          <w14:ligatures w14:val="none"/>
+        </w:rPr>
+        <w:t>Test Connection</w:t>
+      </w:r>
+      <w:r>
+        <w:rPr>
+          <w:rFonts w:eastAsia="Times New Roman" w:cstheme="minorHAnsi"/>
+          <w:color w:val="000000"/>
+          <w:kern w:val="0"/>
+          <w14:ligatures w14:val="none"/>
+        </w:rPr>
+        <w:t>: When clicked, this button tests whether the connection to the remote host is normal</w:t>
+      </w:r>
+    </w:p>
+    <w:p>
+      <w:pPr>
+        <w:numPr>
+          <w:ilvl w:val="1"/>
+          <w:numId w:val="18"/>
+        </w:numPr>
+        <w:rPr>
+          <w:rFonts w:cstheme="minorHAnsi"/>
+        </w:rPr>
+      </w:pPr>
+      <w:r>
+        <w:rPr>
+          <w:rFonts w:cstheme="minorHAnsi"/>
+          <w:b/>
+          <w:bCs/>
+        </w:rPr>
+        <w:t>OK</w:t>
+      </w:r>
+      <w:r>
+        <w:rPr>
+          <w:rFonts w:cstheme="minorHAnsi"/>
+        </w:rPr>
+        <w:t>: Confirm the configuration and close the window</w:t>
+      </w:r>
+    </w:p>
+    <w:p>
+      <w:pPr>
+        <w:numPr>
+          <w:ilvl w:val="1"/>
+          <w:numId w:val="18"/>
+        </w:numPr>
+        <w:rPr>
+          <w:rFonts w:cstheme="minorHAnsi"/>
+        </w:rPr>
+      </w:pPr>
+      <w:r>
+        <w:rPr>
+          <w:rFonts w:cstheme="minorHAnsi"/>
+          <w:b/>
+          <w:bCs/>
+        </w:rPr>
+        <w:t>Cancel</w:t>
+      </w:r>
+      <w:r>
+        <w:rPr>
+          <w:rFonts w:cstheme="minorHAnsi"/>
+        </w:rPr>
+        <w:t>: Cancel the configuration and close the window</w:t>
+      </w:r>
+    </w:p>
+    <w:p>
       <w:r>
         <w:pict w14:anchorId="0B5131D8">
-          <v:rect id="_x0000_i1033" style="width:0;height:1.5pt" o:hralign="center" o:hrstd="t" o:hrnoshade="t" o:hr="t" fillcolor="black" stroked="f"/>
+          <v:rect id="_x0000_i1080" style="width:0;height:1.5pt" o:hralign="center" o:hrstd="t" o:hrnoshade="t" o:hr="t" fillcolor="black" stroked="f"/>
         </w:pict>
       </w:r>
     </w:p>
     <w:p>
       <w:r>
-        <w:t>4. Quick Build</w:t>
+        <w:rPr>
+          <w:rFonts w:hint="eastAsia"/>
+        </w:rPr>
+        <w:t>5</w:t>
+      </w:r>
+      <w:r>
+        <w:t>. Quick Build</w:t>
       </w:r>
     </w:p>
     <w:p>
@@ -1804,6 +2400,7 @@
         </w:numPr>
       </w:pPr>
       <w:r>
+        <w:lastRenderedPageBreak/>
         <w:t>Build Panel_G0M: Compiles the panel program for G0M.</w:t>
       </w:r>
     </w:p>
@@ -1827,12 +2424,17 @@
     </w:p>
     <w:p>
       <w:r>
-        <w:t>5. Custom Build</w:t>
-      </w:r>
-    </w:p>
-    <w:p>
-      <w:r>
-        <w:lastRenderedPageBreak/>
+        <w:rPr>
+          <w:rFonts w:hint="eastAsia"/>
+        </w:rPr>
+        <w:t>6</w:t>
+      </w:r>
+      <w:r>
+        <w:t>. Custom Build</w:t>
+      </w:r>
+    </w:p>
+    <w:p>
+      <w:r>
         <w:t>Use this for more granular control over the compilation:</w:t>
       </w:r>
     </w:p>
@@ -1910,7 +2512,13 @@
     </w:p>
     <w:p>
       <w:r>
-        <w:t>6. Log</w:t>
+        <w:rPr>
+          <w:rFonts w:hint="eastAsia"/>
+        </w:rPr>
+        <w:t>7</w:t>
+      </w:r>
+      <w:r>
+        <w:t>. Log</w:t>
       </w:r>
     </w:p>
     <w:p>
@@ -1958,7 +2566,13 @@
     </w:p>
     <w:p>
       <w:r>
-        <w:t>7. Standard Workflow</w:t>
+        <w:rPr>
+          <w:rFonts w:hint="eastAsia"/>
+        </w:rPr>
+        <w:t>8</w:t>
+      </w:r>
+      <w:r>
+        <w:t>. Standard Workflow</w:t>
       </w:r>
     </w:p>
     <w:p>
@@ -2066,89 +2680,6 @@
       </w:pPr>
       <w:r>
         <w:t>Check the build output in the Log area on the right. If it fails, use "Open Log Path" to locate detailed errors.</w:t>
-      </w:r>
-    </w:p>
-    <w:p>
-      <w:r>
-        <w:pict w14:anchorId="3DBE35C2">
-          <v:rect id="_x0000_i1037" style="width:0;height:1.5pt" o:hralign="center" o:hrstd="t" o:hrnoshade="t" o:hr="t" fillcolor="black" stroked="f"/>
-        </w:pict>
-      </w:r>
-    </w:p>
-    <w:p>
-      <w:r>
-        <w:t>8. Troubleshooting</w:t>
-      </w:r>
-    </w:p>
-    <w:p>
-      <w:pPr>
-        <w:numPr>
-          <w:ilvl w:val="0"/>
-          <w:numId w:val="13"/>
-        </w:numPr>
-      </w:pPr>
-      <w:r>
-        <w:rPr>
-          <w:b/>
-          <w:bCs/>
-        </w:rPr>
-        <w:t>Error: "The filename, directory name, or volume label syntax is incorrect"</w:t>
-      </w:r>
-      <w:r>
-        <w:t>: Check if the path contains invalid characters or spaces, and ensure the path format is correct.</w:t>
-      </w:r>
-    </w:p>
-    <w:p>
-      <w:pPr>
-        <w:numPr>
-          <w:ilvl w:val="0"/>
-          <w:numId w:val="13"/>
-        </w:numPr>
-      </w:pPr>
-      <w:r>
-        <w:rPr>
-          <w:b/>
-          <w:bCs/>
-        </w:rPr>
-        <w:lastRenderedPageBreak/>
-        <w:t>Build failure</w:t>
-      </w:r>
-      <w:r>
-        <w:t>: Check the log for specific error messages and confirm that dependent environments (e.g., compiler, SDK) are installed correctly.</w:t>
-      </w:r>
-    </w:p>
-    <w:p>
-      <w:pPr>
-        <w:numPr>
-          <w:ilvl w:val="0"/>
-          <w:numId w:val="13"/>
-        </w:numPr>
-      </w:pPr>
-      <w:r>
-        <w:rPr>
-          <w:b/>
-          <w:bCs/>
-        </w:rPr>
-        <w:t>No output generated</w:t>
-      </w:r>
-      <w:r>
-        <w:t xml:space="preserve">: Check if the Target Path has </w:t>
-      </w:r>
-      <w:proofErr w:type="gramStart"/>
-      <w:r>
-        <w:t>write</w:t>
-      </w:r>
-      <w:proofErr w:type="gramEnd"/>
-      <w:r>
-        <w:t xml:space="preserve"> permissions and </w:t>
-      </w:r>
-      <w:proofErr w:type="gramStart"/>
-      <w:r>
-        <w:t>confirm</w:t>
-      </w:r>
-      <w:proofErr w:type="gramEnd"/>
-      <w:r>
-        <w:t xml:space="preserve"> that the build options are correct.</w:t>
       </w:r>
     </w:p>
     <w:p/>
@@ -2332,6 +2863,453 @@
     </w:lvl>
   </w:abstractNum>
   <w:abstractNum w:abstractNumId="1" w15:restartNumberingAfterBreak="0">
+    <w:nsid w:val="088221E4"/>
+    <w:multiLevelType w:val="multilevel"/>
+    <w:tmpl w:val="A27ABD7C"/>
+    <w:lvl w:ilvl="0">
+      <w:start w:val="1"/>
+      <w:numFmt w:val="bullet"/>
+      <w:lvlText w:val=""/>
+      <w:lvlJc w:val="left"/>
+      <w:pPr>
+        <w:tabs>
+          <w:tab w:val="num" w:pos="720"/>
+        </w:tabs>
+        <w:ind w:left="720" w:hanging="360"/>
+      </w:pPr>
+      <w:rPr>
+        <w:rFonts w:ascii="Symbol" w:hAnsi="Symbol" w:hint="default"/>
+        <w:sz w:val="20"/>
+      </w:rPr>
+    </w:lvl>
+    <w:lvl w:ilvl="1" w:tentative="1">
+      <w:start w:val="1"/>
+      <w:numFmt w:val="bullet"/>
+      <w:lvlText w:val="o"/>
+      <w:lvlJc w:val="left"/>
+      <w:pPr>
+        <w:tabs>
+          <w:tab w:val="num" w:pos="1440"/>
+        </w:tabs>
+        <w:ind w:left="1440" w:hanging="360"/>
+      </w:pPr>
+      <w:rPr>
+        <w:rFonts w:ascii="Courier New" w:hAnsi="Courier New" w:hint="default"/>
+        <w:sz w:val="20"/>
+      </w:rPr>
+    </w:lvl>
+    <w:lvl w:ilvl="2" w:tentative="1">
+      <w:start w:val="1"/>
+      <w:numFmt w:val="bullet"/>
+      <w:lvlText w:val=""/>
+      <w:lvlJc w:val="left"/>
+      <w:pPr>
+        <w:tabs>
+          <w:tab w:val="num" w:pos="2160"/>
+        </w:tabs>
+        <w:ind w:left="2160" w:hanging="360"/>
+      </w:pPr>
+      <w:rPr>
+        <w:rFonts w:ascii="Wingdings" w:hAnsi="Wingdings" w:hint="default"/>
+        <w:sz w:val="20"/>
+      </w:rPr>
+    </w:lvl>
+    <w:lvl w:ilvl="3" w:tentative="1">
+      <w:start w:val="1"/>
+      <w:numFmt w:val="bullet"/>
+      <w:lvlText w:val=""/>
+      <w:lvlJc w:val="left"/>
+      <w:pPr>
+        <w:tabs>
+          <w:tab w:val="num" w:pos="2880"/>
+        </w:tabs>
+        <w:ind w:left="2880" w:hanging="360"/>
+      </w:pPr>
+      <w:rPr>
+        <w:rFonts w:ascii="Wingdings" w:hAnsi="Wingdings" w:hint="default"/>
+        <w:sz w:val="20"/>
+      </w:rPr>
+    </w:lvl>
+    <w:lvl w:ilvl="4" w:tentative="1">
+      <w:start w:val="1"/>
+      <w:numFmt w:val="bullet"/>
+      <w:lvlText w:val=""/>
+      <w:lvlJc w:val="left"/>
+      <w:pPr>
+        <w:tabs>
+          <w:tab w:val="num" w:pos="3600"/>
+        </w:tabs>
+        <w:ind w:left="3600" w:hanging="360"/>
+      </w:pPr>
+      <w:rPr>
+        <w:rFonts w:ascii="Wingdings" w:hAnsi="Wingdings" w:hint="default"/>
+        <w:sz w:val="20"/>
+      </w:rPr>
+    </w:lvl>
+    <w:lvl w:ilvl="5" w:tentative="1">
+      <w:start w:val="1"/>
+      <w:numFmt w:val="bullet"/>
+      <w:lvlText w:val=""/>
+      <w:lvlJc w:val="left"/>
+      <w:pPr>
+        <w:tabs>
+          <w:tab w:val="num" w:pos="4320"/>
+        </w:tabs>
+        <w:ind w:left="4320" w:hanging="360"/>
+      </w:pPr>
+      <w:rPr>
+        <w:rFonts w:ascii="Wingdings" w:hAnsi="Wingdings" w:hint="default"/>
+        <w:sz w:val="20"/>
+      </w:rPr>
+    </w:lvl>
+    <w:lvl w:ilvl="6" w:tentative="1">
+      <w:start w:val="1"/>
+      <w:numFmt w:val="bullet"/>
+      <w:lvlText w:val=""/>
+      <w:lvlJc w:val="left"/>
+      <w:pPr>
+        <w:tabs>
+          <w:tab w:val="num" w:pos="5040"/>
+        </w:tabs>
+        <w:ind w:left="5040" w:hanging="360"/>
+      </w:pPr>
+      <w:rPr>
+        <w:rFonts w:ascii="Wingdings" w:hAnsi="Wingdings" w:hint="default"/>
+        <w:sz w:val="20"/>
+      </w:rPr>
+    </w:lvl>
+    <w:lvl w:ilvl="7" w:tentative="1">
+      <w:start w:val="1"/>
+      <w:numFmt w:val="bullet"/>
+      <w:lvlText w:val=""/>
+      <w:lvlJc w:val="left"/>
+      <w:pPr>
+        <w:tabs>
+          <w:tab w:val="num" w:pos="5760"/>
+        </w:tabs>
+        <w:ind w:left="5760" w:hanging="360"/>
+      </w:pPr>
+      <w:rPr>
+        <w:rFonts w:ascii="Wingdings" w:hAnsi="Wingdings" w:hint="default"/>
+        <w:sz w:val="20"/>
+      </w:rPr>
+    </w:lvl>
+    <w:lvl w:ilvl="8" w:tentative="1">
+      <w:start w:val="1"/>
+      <w:numFmt w:val="bullet"/>
+      <w:lvlText w:val=""/>
+      <w:lvlJc w:val="left"/>
+      <w:pPr>
+        <w:tabs>
+          <w:tab w:val="num" w:pos="6480"/>
+        </w:tabs>
+        <w:ind w:left="6480" w:hanging="360"/>
+      </w:pPr>
+      <w:rPr>
+        <w:rFonts w:ascii="Wingdings" w:hAnsi="Wingdings" w:hint="default"/>
+        <w:sz w:val="20"/>
+      </w:rPr>
+    </w:lvl>
+  </w:abstractNum>
+  <w:abstractNum w:abstractNumId="2" w15:restartNumberingAfterBreak="0">
+    <w:nsid w:val="12AA2F15"/>
+    <w:multiLevelType w:val="multilevel"/>
+    <w:tmpl w:val="051A3040"/>
+    <w:lvl w:ilvl="0">
+      <w:start w:val="1"/>
+      <w:numFmt w:val="bullet"/>
+      <w:lvlText w:val=""/>
+      <w:lvlJc w:val="left"/>
+      <w:pPr>
+        <w:tabs>
+          <w:tab w:val="num" w:pos="720"/>
+        </w:tabs>
+        <w:ind w:left="720" w:hanging="360"/>
+      </w:pPr>
+      <w:rPr>
+        <w:rFonts w:ascii="Symbol" w:hAnsi="Symbol" w:hint="default"/>
+        <w:sz w:val="20"/>
+      </w:rPr>
+    </w:lvl>
+    <w:lvl w:ilvl="1" w:tentative="1">
+      <w:start w:val="1"/>
+      <w:numFmt w:val="bullet"/>
+      <w:lvlText w:val="o"/>
+      <w:lvlJc w:val="left"/>
+      <w:pPr>
+        <w:tabs>
+          <w:tab w:val="num" w:pos="1440"/>
+        </w:tabs>
+        <w:ind w:left="1440" w:hanging="360"/>
+      </w:pPr>
+      <w:rPr>
+        <w:rFonts w:ascii="Courier New" w:hAnsi="Courier New" w:hint="default"/>
+        <w:sz w:val="20"/>
+      </w:rPr>
+    </w:lvl>
+    <w:lvl w:ilvl="2" w:tentative="1">
+      <w:start w:val="1"/>
+      <w:numFmt w:val="bullet"/>
+      <w:lvlText w:val=""/>
+      <w:lvlJc w:val="left"/>
+      <w:pPr>
+        <w:tabs>
+          <w:tab w:val="num" w:pos="2160"/>
+        </w:tabs>
+        <w:ind w:left="2160" w:hanging="360"/>
+      </w:pPr>
+      <w:rPr>
+        <w:rFonts w:ascii="Wingdings" w:hAnsi="Wingdings" w:hint="default"/>
+        <w:sz w:val="20"/>
+      </w:rPr>
+    </w:lvl>
+    <w:lvl w:ilvl="3" w:tentative="1">
+      <w:start w:val="1"/>
+      <w:numFmt w:val="bullet"/>
+      <w:lvlText w:val=""/>
+      <w:lvlJc w:val="left"/>
+      <w:pPr>
+        <w:tabs>
+          <w:tab w:val="num" w:pos="2880"/>
+        </w:tabs>
+        <w:ind w:left="2880" w:hanging="360"/>
+      </w:pPr>
+      <w:rPr>
+        <w:rFonts w:ascii="Wingdings" w:hAnsi="Wingdings" w:hint="default"/>
+        <w:sz w:val="20"/>
+      </w:rPr>
+    </w:lvl>
+    <w:lvl w:ilvl="4" w:tentative="1">
+      <w:start w:val="1"/>
+      <w:numFmt w:val="bullet"/>
+      <w:lvlText w:val=""/>
+      <w:lvlJc w:val="left"/>
+      <w:pPr>
+        <w:tabs>
+          <w:tab w:val="num" w:pos="3600"/>
+        </w:tabs>
+        <w:ind w:left="3600" w:hanging="360"/>
+      </w:pPr>
+      <w:rPr>
+        <w:rFonts w:ascii="Wingdings" w:hAnsi="Wingdings" w:hint="default"/>
+        <w:sz w:val="20"/>
+      </w:rPr>
+    </w:lvl>
+    <w:lvl w:ilvl="5" w:tentative="1">
+      <w:start w:val="1"/>
+      <w:numFmt w:val="bullet"/>
+      <w:lvlText w:val=""/>
+      <w:lvlJc w:val="left"/>
+      <w:pPr>
+        <w:tabs>
+          <w:tab w:val="num" w:pos="4320"/>
+        </w:tabs>
+        <w:ind w:left="4320" w:hanging="360"/>
+      </w:pPr>
+      <w:rPr>
+        <w:rFonts w:ascii="Wingdings" w:hAnsi="Wingdings" w:hint="default"/>
+        <w:sz w:val="20"/>
+      </w:rPr>
+    </w:lvl>
+    <w:lvl w:ilvl="6" w:tentative="1">
+      <w:start w:val="1"/>
+      <w:numFmt w:val="bullet"/>
+      <w:lvlText w:val=""/>
+      <w:lvlJc w:val="left"/>
+      <w:pPr>
+        <w:tabs>
+          <w:tab w:val="num" w:pos="5040"/>
+        </w:tabs>
+        <w:ind w:left="5040" w:hanging="360"/>
+      </w:pPr>
+      <w:rPr>
+        <w:rFonts w:ascii="Wingdings" w:hAnsi="Wingdings" w:hint="default"/>
+        <w:sz w:val="20"/>
+      </w:rPr>
+    </w:lvl>
+    <w:lvl w:ilvl="7" w:tentative="1">
+      <w:start w:val="1"/>
+      <w:numFmt w:val="bullet"/>
+      <w:lvlText w:val=""/>
+      <w:lvlJc w:val="left"/>
+      <w:pPr>
+        <w:tabs>
+          <w:tab w:val="num" w:pos="5760"/>
+        </w:tabs>
+        <w:ind w:left="5760" w:hanging="360"/>
+      </w:pPr>
+      <w:rPr>
+        <w:rFonts w:ascii="Wingdings" w:hAnsi="Wingdings" w:hint="default"/>
+        <w:sz w:val="20"/>
+      </w:rPr>
+    </w:lvl>
+    <w:lvl w:ilvl="8" w:tentative="1">
+      <w:start w:val="1"/>
+      <w:numFmt w:val="bullet"/>
+      <w:lvlText w:val=""/>
+      <w:lvlJc w:val="left"/>
+      <w:pPr>
+        <w:tabs>
+          <w:tab w:val="num" w:pos="6480"/>
+        </w:tabs>
+        <w:ind w:left="6480" w:hanging="360"/>
+      </w:pPr>
+      <w:rPr>
+        <w:rFonts w:ascii="Wingdings" w:hAnsi="Wingdings" w:hint="default"/>
+        <w:sz w:val="20"/>
+      </w:rPr>
+    </w:lvl>
+  </w:abstractNum>
+  <w:abstractNum w:abstractNumId="3" w15:restartNumberingAfterBreak="0">
+    <w:nsid w:val="13BB13A1"/>
+    <w:multiLevelType w:val="multilevel"/>
+    <w:tmpl w:val="54304CC6"/>
+    <w:lvl w:ilvl="0">
+      <w:start w:val="1"/>
+      <w:numFmt w:val="bullet"/>
+      <w:lvlText w:val="o"/>
+      <w:lvlJc w:val="left"/>
+      <w:pPr>
+        <w:tabs>
+          <w:tab w:val="num" w:pos="720"/>
+        </w:tabs>
+        <w:ind w:left="720" w:hanging="360"/>
+      </w:pPr>
+      <w:rPr>
+        <w:rFonts w:ascii="Courier New" w:hAnsi="Courier New" w:cs="Courier New" w:hint="default"/>
+        <w:sz w:val="20"/>
+      </w:rPr>
+    </w:lvl>
+    <w:lvl w:ilvl="1" w:tentative="1">
+      <w:start w:val="1"/>
+      <w:numFmt w:val="bullet"/>
+      <w:lvlText w:val="o"/>
+      <w:lvlJc w:val="left"/>
+      <w:pPr>
+        <w:tabs>
+          <w:tab w:val="num" w:pos="1440"/>
+        </w:tabs>
+        <w:ind w:left="1440" w:hanging="360"/>
+      </w:pPr>
+      <w:rPr>
+        <w:rFonts w:ascii="Courier New" w:hAnsi="Courier New" w:hint="default"/>
+        <w:sz w:val="20"/>
+      </w:rPr>
+    </w:lvl>
+    <w:lvl w:ilvl="2" w:tentative="1">
+      <w:start w:val="1"/>
+      <w:numFmt w:val="bullet"/>
+      <w:lvlText w:val=""/>
+      <w:lvlJc w:val="left"/>
+      <w:pPr>
+        <w:tabs>
+          <w:tab w:val="num" w:pos="2160"/>
+        </w:tabs>
+        <w:ind w:left="2160" w:hanging="360"/>
+      </w:pPr>
+      <w:rPr>
+        <w:rFonts w:ascii="Wingdings" w:hAnsi="Wingdings" w:hint="default"/>
+        <w:sz w:val="20"/>
+      </w:rPr>
+    </w:lvl>
+    <w:lvl w:ilvl="3" w:tentative="1">
+      <w:start w:val="1"/>
+      <w:numFmt w:val="bullet"/>
+      <w:lvlText w:val=""/>
+      <w:lvlJc w:val="left"/>
+      <w:pPr>
+        <w:tabs>
+          <w:tab w:val="num" w:pos="2880"/>
+        </w:tabs>
+        <w:ind w:left="2880" w:hanging="360"/>
+      </w:pPr>
+      <w:rPr>
+        <w:rFonts w:ascii="Wingdings" w:hAnsi="Wingdings" w:hint="default"/>
+        <w:sz w:val="20"/>
+      </w:rPr>
+    </w:lvl>
+    <w:lvl w:ilvl="4" w:tentative="1">
+      <w:start w:val="1"/>
+      <w:numFmt w:val="bullet"/>
+      <w:lvlText w:val=""/>
+      <w:lvlJc w:val="left"/>
+      <w:pPr>
+        <w:tabs>
+          <w:tab w:val="num" w:pos="3600"/>
+        </w:tabs>
+        <w:ind w:left="3600" w:hanging="360"/>
+      </w:pPr>
+      <w:rPr>
+        <w:rFonts w:ascii="Wingdings" w:hAnsi="Wingdings" w:hint="default"/>
+        <w:sz w:val="20"/>
+      </w:rPr>
+    </w:lvl>
+    <w:lvl w:ilvl="5" w:tentative="1">
+      <w:start w:val="1"/>
+      <w:numFmt w:val="bullet"/>
+      <w:lvlText w:val=""/>
+      <w:lvlJc w:val="left"/>
+      <w:pPr>
+        <w:tabs>
+          <w:tab w:val="num" w:pos="4320"/>
+        </w:tabs>
+        <w:ind w:left="4320" w:hanging="360"/>
+      </w:pPr>
+      <w:rPr>
+        <w:rFonts w:ascii="Wingdings" w:hAnsi="Wingdings" w:hint="default"/>
+        <w:sz w:val="20"/>
+      </w:rPr>
+    </w:lvl>
+    <w:lvl w:ilvl="6" w:tentative="1">
+      <w:start w:val="1"/>
+      <w:numFmt w:val="bullet"/>
+      <w:lvlText w:val=""/>
+      <w:lvlJc w:val="left"/>
+      <w:pPr>
+        <w:tabs>
+          <w:tab w:val="num" w:pos="5040"/>
+        </w:tabs>
+        <w:ind w:left="5040" w:hanging="360"/>
+      </w:pPr>
+      <w:rPr>
+        <w:rFonts w:ascii="Wingdings" w:hAnsi="Wingdings" w:hint="default"/>
+        <w:sz w:val="20"/>
+      </w:rPr>
+    </w:lvl>
+    <w:lvl w:ilvl="7" w:tentative="1">
+      <w:start w:val="1"/>
+      <w:numFmt w:val="bullet"/>
+      <w:lvlText w:val=""/>
+      <w:lvlJc w:val="left"/>
+      <w:pPr>
+        <w:tabs>
+          <w:tab w:val="num" w:pos="5760"/>
+        </w:tabs>
+        <w:ind w:left="5760" w:hanging="360"/>
+      </w:pPr>
+      <w:rPr>
+        <w:rFonts w:ascii="Wingdings" w:hAnsi="Wingdings" w:hint="default"/>
+        <w:sz w:val="20"/>
+      </w:rPr>
+    </w:lvl>
+    <w:lvl w:ilvl="8" w:tentative="1">
+      <w:start w:val="1"/>
+      <w:numFmt w:val="bullet"/>
+      <w:lvlText w:val=""/>
+      <w:lvlJc w:val="left"/>
+      <w:pPr>
+        <w:tabs>
+          <w:tab w:val="num" w:pos="6480"/>
+        </w:tabs>
+        <w:ind w:left="6480" w:hanging="360"/>
+      </w:pPr>
+      <w:rPr>
+        <w:rFonts w:ascii="Wingdings" w:hAnsi="Wingdings" w:hint="default"/>
+        <w:sz w:val="20"/>
+      </w:rPr>
+    </w:lvl>
+  </w:abstractNum>
+  <w:abstractNum w:abstractNumId="4" w15:restartNumberingAfterBreak="0">
     <w:nsid w:val="1A1D09DE"/>
     <w:multiLevelType w:val="multilevel"/>
     <w:tmpl w:val="95D453A8"/>
@@ -2480,7 +3458,7 @@
       </w:rPr>
     </w:lvl>
   </w:abstractNum>
-  <w:abstractNum w:abstractNumId="2" w15:restartNumberingAfterBreak="0">
+  <w:abstractNum w:abstractNumId="5" w15:restartNumberingAfterBreak="0">
     <w:nsid w:val="20134184"/>
     <w:multiLevelType w:val="multilevel"/>
     <w:tmpl w:val="68DC2592"/>
@@ -2597,7 +3575,7 @@
       </w:pPr>
     </w:lvl>
   </w:abstractNum>
-  <w:abstractNum w:abstractNumId="3" w15:restartNumberingAfterBreak="0">
+  <w:abstractNum w:abstractNumId="6" w15:restartNumberingAfterBreak="0">
     <w:nsid w:val="37DD626E"/>
     <w:multiLevelType w:val="multilevel"/>
     <w:tmpl w:val="E048AF1A"/>
@@ -2746,7 +3724,120 @@
       </w:rPr>
     </w:lvl>
   </w:abstractNum>
-  <w:abstractNum w:abstractNumId="4" w15:restartNumberingAfterBreak="0">
+  <w:abstractNum w:abstractNumId="7" w15:restartNumberingAfterBreak="0">
+    <w:nsid w:val="40FB15D0"/>
+    <w:multiLevelType w:val="hybridMultilevel"/>
+    <w:tmpl w:val="22B27A0C"/>
+    <w:lvl w:ilvl="0" w:tplc="04090003">
+      <w:start w:val="1"/>
+      <w:numFmt w:val="bullet"/>
+      <w:lvlText w:val="o"/>
+      <w:lvlJc w:val="left"/>
+      <w:pPr>
+        <w:ind w:left="1080" w:hanging="360"/>
+      </w:pPr>
+      <w:rPr>
+        <w:rFonts w:ascii="Courier New" w:hAnsi="Courier New" w:cs="Courier New" w:hint="default"/>
+      </w:rPr>
+    </w:lvl>
+    <w:lvl w:ilvl="1" w:tplc="04090003">
+      <w:start w:val="1"/>
+      <w:numFmt w:val="bullet"/>
+      <w:lvlText w:val="o"/>
+      <w:lvlJc w:val="left"/>
+      <w:pPr>
+        <w:ind w:left="1800" w:hanging="360"/>
+      </w:pPr>
+      <w:rPr>
+        <w:rFonts w:ascii="Courier New" w:hAnsi="Courier New" w:cs="Courier New" w:hint="default"/>
+      </w:rPr>
+    </w:lvl>
+    <w:lvl w:ilvl="2" w:tplc="04090005" w:tentative="1">
+      <w:start w:val="1"/>
+      <w:numFmt w:val="bullet"/>
+      <w:lvlText w:val=""/>
+      <w:lvlJc w:val="left"/>
+      <w:pPr>
+        <w:ind w:left="2520" w:hanging="360"/>
+      </w:pPr>
+      <w:rPr>
+        <w:rFonts w:ascii="Wingdings" w:hAnsi="Wingdings" w:hint="default"/>
+      </w:rPr>
+    </w:lvl>
+    <w:lvl w:ilvl="3" w:tplc="04090001" w:tentative="1">
+      <w:start w:val="1"/>
+      <w:numFmt w:val="bullet"/>
+      <w:lvlText w:val=""/>
+      <w:lvlJc w:val="left"/>
+      <w:pPr>
+        <w:ind w:left="3240" w:hanging="360"/>
+      </w:pPr>
+      <w:rPr>
+        <w:rFonts w:ascii="Symbol" w:hAnsi="Symbol" w:hint="default"/>
+      </w:rPr>
+    </w:lvl>
+    <w:lvl w:ilvl="4" w:tplc="04090003" w:tentative="1">
+      <w:start w:val="1"/>
+      <w:numFmt w:val="bullet"/>
+      <w:lvlText w:val="o"/>
+      <w:lvlJc w:val="left"/>
+      <w:pPr>
+        <w:ind w:left="3960" w:hanging="360"/>
+      </w:pPr>
+      <w:rPr>
+        <w:rFonts w:ascii="Courier New" w:hAnsi="Courier New" w:cs="Courier New" w:hint="default"/>
+      </w:rPr>
+    </w:lvl>
+    <w:lvl w:ilvl="5" w:tplc="04090005" w:tentative="1">
+      <w:start w:val="1"/>
+      <w:numFmt w:val="bullet"/>
+      <w:lvlText w:val=""/>
+      <w:lvlJc w:val="left"/>
+      <w:pPr>
+        <w:ind w:left="4680" w:hanging="360"/>
+      </w:pPr>
+      <w:rPr>
+        <w:rFonts w:ascii="Wingdings" w:hAnsi="Wingdings" w:hint="default"/>
+      </w:rPr>
+    </w:lvl>
+    <w:lvl w:ilvl="6" w:tplc="04090001" w:tentative="1">
+      <w:start w:val="1"/>
+      <w:numFmt w:val="bullet"/>
+      <w:lvlText w:val=""/>
+      <w:lvlJc w:val="left"/>
+      <w:pPr>
+        <w:ind w:left="5400" w:hanging="360"/>
+      </w:pPr>
+      <w:rPr>
+        <w:rFonts w:ascii="Symbol" w:hAnsi="Symbol" w:hint="default"/>
+      </w:rPr>
+    </w:lvl>
+    <w:lvl w:ilvl="7" w:tplc="04090003" w:tentative="1">
+      <w:start w:val="1"/>
+      <w:numFmt w:val="bullet"/>
+      <w:lvlText w:val="o"/>
+      <w:lvlJc w:val="left"/>
+      <w:pPr>
+        <w:ind w:left="6120" w:hanging="360"/>
+      </w:pPr>
+      <w:rPr>
+        <w:rFonts w:ascii="Courier New" w:hAnsi="Courier New" w:cs="Courier New" w:hint="default"/>
+      </w:rPr>
+    </w:lvl>
+    <w:lvl w:ilvl="8" w:tplc="04090005" w:tentative="1">
+      <w:start w:val="1"/>
+      <w:numFmt w:val="bullet"/>
+      <w:lvlText w:val=""/>
+      <w:lvlJc w:val="left"/>
+      <w:pPr>
+        <w:ind w:left="6840" w:hanging="360"/>
+      </w:pPr>
+      <w:rPr>
+        <w:rFonts w:ascii="Wingdings" w:hAnsi="Wingdings" w:hint="default"/>
+      </w:rPr>
+    </w:lvl>
+  </w:abstractNum>
+  <w:abstractNum w:abstractNumId="8" w15:restartNumberingAfterBreak="0">
     <w:nsid w:val="43EC7BA1"/>
     <w:multiLevelType w:val="multilevel"/>
     <w:tmpl w:val="32DC9F80"/>
@@ -2859,7 +3950,124 @@
       </w:pPr>
     </w:lvl>
   </w:abstractNum>
-  <w:abstractNum w:abstractNumId="5" w15:restartNumberingAfterBreak="0">
+  <w:abstractNum w:abstractNumId="9" w15:restartNumberingAfterBreak="0">
+    <w:nsid w:val="45A87AB4"/>
+    <w:multiLevelType w:val="multilevel"/>
+    <w:tmpl w:val="2A9CF398"/>
+    <w:lvl w:ilvl="0">
+      <w:start w:val="1"/>
+      <w:numFmt w:val="decimal"/>
+      <w:lvlText w:val="%1."/>
+      <w:lvlJc w:val="left"/>
+      <w:pPr>
+        <w:tabs>
+          <w:tab w:val="num" w:pos="720"/>
+        </w:tabs>
+        <w:ind w:left="720" w:hanging="360"/>
+      </w:pPr>
+    </w:lvl>
+    <w:lvl w:ilvl="1">
+      <w:start w:val="1"/>
+      <w:numFmt w:val="bullet"/>
+      <w:lvlText w:val="o"/>
+      <w:lvlJc w:val="left"/>
+      <w:pPr>
+        <w:tabs>
+          <w:tab w:val="num" w:pos="1440"/>
+        </w:tabs>
+        <w:ind w:left="1440" w:hanging="360"/>
+      </w:pPr>
+      <w:rPr>
+        <w:rFonts w:ascii="Courier New" w:hAnsi="Courier New" w:hint="default"/>
+        <w:sz w:val="20"/>
+      </w:rPr>
+    </w:lvl>
+    <w:lvl w:ilvl="2" w:tentative="1">
+      <w:start w:val="1"/>
+      <w:numFmt w:val="decimal"/>
+      <w:lvlText w:val="%3."/>
+      <w:lvlJc w:val="left"/>
+      <w:pPr>
+        <w:tabs>
+          <w:tab w:val="num" w:pos="2160"/>
+        </w:tabs>
+        <w:ind w:left="2160" w:hanging="360"/>
+      </w:pPr>
+    </w:lvl>
+    <w:lvl w:ilvl="3" w:tentative="1">
+      <w:start w:val="1"/>
+      <w:numFmt w:val="decimal"/>
+      <w:lvlText w:val="%4."/>
+      <w:lvlJc w:val="left"/>
+      <w:pPr>
+        <w:tabs>
+          <w:tab w:val="num" w:pos="2880"/>
+        </w:tabs>
+        <w:ind w:left="2880" w:hanging="360"/>
+      </w:pPr>
+    </w:lvl>
+    <w:lvl w:ilvl="4" w:tentative="1">
+      <w:start w:val="1"/>
+      <w:numFmt w:val="decimal"/>
+      <w:lvlText w:val="%5."/>
+      <w:lvlJc w:val="left"/>
+      <w:pPr>
+        <w:tabs>
+          <w:tab w:val="num" w:pos="3600"/>
+        </w:tabs>
+        <w:ind w:left="3600" w:hanging="360"/>
+      </w:pPr>
+    </w:lvl>
+    <w:lvl w:ilvl="5" w:tentative="1">
+      <w:start w:val="1"/>
+      <w:numFmt w:val="decimal"/>
+      <w:lvlText w:val="%6."/>
+      <w:lvlJc w:val="left"/>
+      <w:pPr>
+        <w:tabs>
+          <w:tab w:val="num" w:pos="4320"/>
+        </w:tabs>
+        <w:ind w:left="4320" w:hanging="360"/>
+      </w:pPr>
+    </w:lvl>
+    <w:lvl w:ilvl="6" w:tentative="1">
+      <w:start w:val="1"/>
+      <w:numFmt w:val="decimal"/>
+      <w:lvlText w:val="%7."/>
+      <w:lvlJc w:val="left"/>
+      <w:pPr>
+        <w:tabs>
+          <w:tab w:val="num" w:pos="5040"/>
+        </w:tabs>
+        <w:ind w:left="5040" w:hanging="360"/>
+      </w:pPr>
+    </w:lvl>
+    <w:lvl w:ilvl="7" w:tentative="1">
+      <w:start w:val="1"/>
+      <w:numFmt w:val="decimal"/>
+      <w:lvlText w:val="%8."/>
+      <w:lvlJc w:val="left"/>
+      <w:pPr>
+        <w:tabs>
+          <w:tab w:val="num" w:pos="5760"/>
+        </w:tabs>
+        <w:ind w:left="5760" w:hanging="360"/>
+      </w:pPr>
+    </w:lvl>
+    <w:lvl w:ilvl="8" w:tentative="1">
+      <w:start w:val="1"/>
+      <w:numFmt w:val="decimal"/>
+      <w:lvlText w:val="%9."/>
+      <w:lvlJc w:val="left"/>
+      <w:pPr>
+        <w:tabs>
+          <w:tab w:val="num" w:pos="6480"/>
+        </w:tabs>
+        <w:ind w:left="6480" w:hanging="360"/>
+      </w:pPr>
+    </w:lvl>
+  </w:abstractNum>
+  <w:abstractNum w:abstractNumId="10" w15:restartNumberingAfterBreak="0">
     <w:nsid w:val="466E37A3"/>
     <w:multiLevelType w:val="multilevel"/>
     <w:tmpl w:val="7048D384"/>
@@ -2972,7 +4180,7 @@
       </w:pPr>
     </w:lvl>
   </w:abstractNum>
-  <w:abstractNum w:abstractNumId="6" w15:restartNumberingAfterBreak="0">
+  <w:abstractNum w:abstractNumId="11" w15:restartNumberingAfterBreak="0">
     <w:nsid w:val="497009B7"/>
     <w:multiLevelType w:val="multilevel"/>
     <w:tmpl w:val="E7C648E6"/>
@@ -3089,7 +4297,7 @@
       </w:pPr>
     </w:lvl>
   </w:abstractNum>
-  <w:abstractNum w:abstractNumId="7" w15:restartNumberingAfterBreak="0">
+  <w:abstractNum w:abstractNumId="12" w15:restartNumberingAfterBreak="0">
     <w:nsid w:val="4AAB4CA2"/>
     <w:multiLevelType w:val="multilevel"/>
     <w:tmpl w:val="700CE4B0"/>
@@ -3206,7 +4414,7 @@
       </w:pPr>
     </w:lvl>
   </w:abstractNum>
-  <w:abstractNum w:abstractNumId="8" w15:restartNumberingAfterBreak="0">
+  <w:abstractNum w:abstractNumId="13" w15:restartNumberingAfterBreak="0">
     <w:nsid w:val="57CB4F11"/>
     <w:multiLevelType w:val="multilevel"/>
     <w:tmpl w:val="F7646420"/>
@@ -3355,7 +4563,7 @@
       </w:rPr>
     </w:lvl>
   </w:abstractNum>
-  <w:abstractNum w:abstractNumId="9" w15:restartNumberingAfterBreak="0">
+  <w:abstractNum w:abstractNumId="14" w15:restartNumberingAfterBreak="0">
     <w:nsid w:val="62F75B16"/>
     <w:multiLevelType w:val="multilevel"/>
     <w:tmpl w:val="2BEA0B66"/>
@@ -3504,7 +4712,7 @@
       </w:rPr>
     </w:lvl>
   </w:abstractNum>
-  <w:abstractNum w:abstractNumId="10" w15:restartNumberingAfterBreak="0">
+  <w:abstractNum w:abstractNumId="15" w15:restartNumberingAfterBreak="0">
     <w:nsid w:val="679F0D7F"/>
     <w:multiLevelType w:val="multilevel"/>
     <w:tmpl w:val="D36A1E64"/>
@@ -3621,7 +4829,7 @@
       </w:pPr>
     </w:lvl>
   </w:abstractNum>
-  <w:abstractNum w:abstractNumId="11" w15:restartNumberingAfterBreak="0">
+  <w:abstractNum w:abstractNumId="16" w15:restartNumberingAfterBreak="0">
     <w:nsid w:val="6CB76EEB"/>
     <w:multiLevelType w:val="multilevel"/>
     <w:tmpl w:val="F44E19F8"/>
@@ -3770,7 +4978,7 @@
       </w:rPr>
     </w:lvl>
   </w:abstractNum>
-  <w:abstractNum w:abstractNumId="12" w15:restartNumberingAfterBreak="0">
+  <w:abstractNum w:abstractNumId="17" w15:restartNumberingAfterBreak="0">
     <w:nsid w:val="7F9E3398"/>
     <w:multiLevelType w:val="multilevel"/>
     <w:tmpl w:val="2A9CF398"/>
@@ -3888,43 +5096,58 @@
     </w:lvl>
   </w:abstractNum>
   <w:num w:numId="1" w16cid:durableId="1438065527">
-    <w:abstractNumId w:val="2"/>
+    <w:abstractNumId w:val="5"/>
   </w:num>
   <w:num w:numId="2" w16cid:durableId="400056393">
-    <w:abstractNumId w:val="6"/>
+    <w:abstractNumId w:val="11"/>
   </w:num>
   <w:num w:numId="3" w16cid:durableId="1770855076">
-    <w:abstractNumId w:val="1"/>
+    <w:abstractNumId w:val="4"/>
   </w:num>
   <w:num w:numId="4" w16cid:durableId="2026204265">
-    <w:abstractNumId w:val="5"/>
+    <w:abstractNumId w:val="10"/>
   </w:num>
   <w:num w:numId="5" w16cid:durableId="1516962575">
-    <w:abstractNumId w:val="8"/>
+    <w:abstractNumId w:val="13"/>
   </w:num>
   <w:num w:numId="6" w16cid:durableId="1823352281">
     <w:abstractNumId w:val="0"/>
   </w:num>
   <w:num w:numId="7" w16cid:durableId="726730308">
-    <w:abstractNumId w:val="10"/>
+    <w:abstractNumId w:val="15"/>
   </w:num>
   <w:num w:numId="8" w16cid:durableId="1772780084">
+    <w:abstractNumId w:val="17"/>
+  </w:num>
+  <w:num w:numId="9" w16cid:durableId="1712879792">
+    <w:abstractNumId w:val="14"/>
+  </w:num>
+  <w:num w:numId="10" w16cid:durableId="835919591">
+    <w:abstractNumId w:val="8"/>
+  </w:num>
+  <w:num w:numId="11" w16cid:durableId="381058171">
+    <w:abstractNumId w:val="6"/>
+  </w:num>
+  <w:num w:numId="12" w16cid:durableId="1869954041">
     <w:abstractNumId w:val="12"/>
   </w:num>
-  <w:num w:numId="9" w16cid:durableId="1712879792">
-    <w:abstractNumId w:val="9"/>
+  <w:num w:numId="13" w16cid:durableId="1457985463">
+    <w:abstractNumId w:val="16"/>
   </w:num>
-  <w:num w:numId="10" w16cid:durableId="835919591">
-    <w:abstractNumId w:val="4"/>
-  </w:num>
-  <w:num w:numId="11" w16cid:durableId="381058171">
+  <w:num w:numId="14" w16cid:durableId="575939986">
     <w:abstractNumId w:val="3"/>
   </w:num>
-  <w:num w:numId="12" w16cid:durableId="1869954041">
+  <w:num w:numId="15" w16cid:durableId="1910965331">
+    <w:abstractNumId w:val="1"/>
+  </w:num>
+  <w:num w:numId="16" w16cid:durableId="1075785869">
+    <w:abstractNumId w:val="2"/>
+  </w:num>
+  <w:num w:numId="17" w16cid:durableId="561335295">
     <w:abstractNumId w:val="7"/>
   </w:num>
-  <w:num w:numId="13" w16cid:durableId="1457985463">
-    <w:abstractNumId w:val="11"/>
+  <w:num w:numId="18" w16cid:durableId="677779302">
+    <w:abstractNumId w:val="9"/>
   </w:num>
 </w:numbering>
 </file>
@@ -4532,7 +5755,6 @@
   <w:style w:type="character" w:default="1" w:styleId="DefaultParagraphFont">
     <w:name w:val="Default Paragraph Font"/>
     <w:uiPriority w:val="1"/>
-    <w:semiHidden/>
     <w:unhideWhenUsed/>
   </w:style>
   <w:style w:type="table" w:default="1" w:styleId="TableNormal">
@@ -4890,6 +6112,28 @@
     <w:uiPriority w:val="99"/>
     <w:rsid w:val="00DE7753"/>
   </w:style>
+  <w:style w:type="character" w:styleId="Strong">
+    <w:name w:val="Strong"/>
+    <w:basedOn w:val="DefaultParagraphFont"/>
+    <w:uiPriority w:val="22"/>
+    <w:qFormat/>
+    <w:rsid w:val="00ED18A6"/>
+    <w:rPr>
+      <w:b/>
+      <w:bCs/>
+    </w:rPr>
+  </w:style>
+  <w:style w:type="character" w:styleId="Emphasis">
+    <w:name w:val="Emphasis"/>
+    <w:basedOn w:val="DefaultParagraphFont"/>
+    <w:uiPriority w:val="20"/>
+    <w:qFormat/>
+    <w:rsid w:val="00ED18A6"/>
+    <w:rPr>
+      <w:i/>
+      <w:iCs/>
+    </w:rPr>
+  </w:style>
 </w:styles>
 </file>
 

</xml_diff>